<commit_message>
PD2 Exam 2: heart sound and murmur listening quiz (18 recordings) and listening guide (22 recordings); audio question type in the quiz engine
Recordings: University of Michigan Heart Sound & Murmur Library (Judge and Mangrulkar), CC BY-SA 3.0, shortened to 20-second excerpts and credited on every question and on the guide. Engine gains an audio field (player where a picture would go, lazy-loaded; Group Study skips audio quizzes).

Co-Authored-By: Claude Sonnet 5.5 <noreply@anthropic.com>
</commit_message>
<xml_diff>
--- a/Physical Diagnosis 2 Exam 2/pd2-exam-2-study-guide.docx
+++ b/Physical Diagnosis 2 Exam 2/pd2-exam-2-study-guide.docx
@@ -4652,6 +4652,138 @@
           <w:sz w:val="20"/>
         </w:rPr>
         <w:t xml:space="preserve"> S4 is considered normal in trained athletes and older populations; it is the mirror of S3, which is physiologic in the young and pathologic in the old, while S4 runs the other way.</w:t>
+      </w:r>
+    </w:p>
+    <w:p>
+      <w:pPr>
+        <w:pStyle w:val="ListBullet"/>
+        <w:spacing w:after="40"/>
+      </w:pPr>
+      <w:r>
+        <w:rPr>
+          <w:b/>
+          <w:i w:val="0"/>
+          <w:sz w:val="20"/>
+        </w:rPr>
+        <w:t>Mid-systolic murmur with physiologic splitting of S2.</w:t>
+      </w:r>
+      <w:r>
+        <w:rPr>
+          <w:b w:val="0"/>
+          <w:i w:val="0"/>
+          <w:sz w:val="20"/>
+        </w:rPr>
+        <w:t xml:space="preserve"> The murmur sits in the middle of systole and the split of S2 comes and goes with breathing, which is physiologic.</w:t>
+      </w:r>
+    </w:p>
+    <w:p>
+      <w:pPr>
+        <w:pStyle w:val="ListBullet"/>
+        <w:spacing w:after="40"/>
+      </w:pPr>
+      <w:r>
+        <w:rPr>
+          <w:b/>
+          <w:i w:val="0"/>
+          <w:sz w:val="20"/>
+        </w:rPr>
+        <w:t>Mid-systolic murmur with pathologic splitting of S2.</w:t>
+      </w:r>
+      <w:r>
+        <w:rPr>
+          <w:b w:val="0"/>
+          <w:i w:val="0"/>
+          <w:sz w:val="20"/>
+        </w:rPr>
+        <w:t xml:space="preserve"> The murmur sits in the middle of systole and the split of S2 stays audible during expiration, which is pathologic and suggests heart disease.</w:t>
+      </w:r>
+    </w:p>
+    <w:p>
+      <w:pPr>
+        <w:pStyle w:val="ListBullet"/>
+        <w:spacing w:after="40"/>
+      </w:pPr>
+      <w:r>
+        <w:rPr>
+          <w:b/>
+          <w:i w:val="0"/>
+          <w:sz w:val="20"/>
+        </w:rPr>
+        <w:t>S3 gallop with a holosystolic murmur.</w:t>
+      </w:r>
+      <w:r>
+        <w:rPr>
+          <w:b w:val="0"/>
+          <w:i w:val="0"/>
+          <w:sz w:val="20"/>
+        </w:rPr>
+        <w:t xml:space="preserve"> An S3 after S2 (Ken-TUC-ky) with a murmur that fills systole fits volume overload from mitral regurgitation, which causes both.</w:t>
+      </w:r>
+    </w:p>
+    <w:p>
+      <w:pPr>
+        <w:pStyle w:val="ListBullet"/>
+        <w:spacing w:after="40"/>
+      </w:pPr>
+      <w:r>
+        <w:rPr>
+          <w:b/>
+          <w:i w:val="0"/>
+          <w:sz w:val="20"/>
+        </w:rPr>
+        <w:t>Ejection sound with a mid-systolic murmur.</w:t>
+      </w:r>
+      <w:r>
+        <w:rPr>
+          <w:b w:val="0"/>
+          <w:i w:val="0"/>
+          <w:sz w:val="20"/>
+        </w:rPr>
+        <w:t xml:space="preserve"> An ejection sound comes right after S1 and is high pitched; with a midsystolic murmur at the pulmonic area it fits pulmonic stenosis, which causes both.</w:t>
+      </w:r>
+    </w:p>
+    <w:p>
+      <w:pPr>
+        <w:pStyle w:val="ListBullet"/>
+        <w:spacing w:after="40"/>
+      </w:pPr>
+      <w:r>
+        <w:rPr>
+          <w:b/>
+          <w:i w:val="0"/>
+          <w:sz w:val="20"/>
+        </w:rPr>
+        <w:t>Opening snap, then a diastolic murmur.</w:t>
+      </w:r>
+      <w:r>
+        <w:rPr>
+          <w:b w:val="0"/>
+          <w:i w:val="0"/>
+          <w:sz w:val="20"/>
+        </w:rPr>
+        <w:t xml:space="preserve"> The snap of a stenotic mitral valve opening is followed by the low-pitched mid to late diastolic murmur of mitral stenosis, heard with the bell at the apex.</w:t>
+      </w:r>
+    </w:p>
+    <w:p>
+      <w:pPr>
+        <w:pStyle w:val="ListBullet"/>
+        <w:spacing w:after="40"/>
+      </w:pPr>
+      <w:r>
+        <w:rPr>
+          <w:b/>
+          <w:i w:val="0"/>
+          <w:sz w:val="20"/>
+        </w:rPr>
+        <w:t>S4 gallop with a mid-systolic murmur.</w:t>
+      </w:r>
+      <w:r>
+        <w:rPr>
+          <w:b w:val="0"/>
+          <w:i w:val="0"/>
+          <w:sz w:val="20"/>
+        </w:rPr>
+        <w:t xml:space="preserve"> The dull S4 just before S1 (Ten-nes-SEE) is followed by a murmur in the middle of systole; aortic stenosis and hypertrophic cardiomyopathy are causes of both.</w:t>
       </w:r>
     </w:p>
     <w:p>

</xml_diff>